<commit_message>
Integrate W1–W7 life and subject practice into 100-minute lessons
</commit_message>
<xml_diff>
--- a/worksheets/W1_學科遷移.docx
+++ b/worksheets/W1_學科遷移.docx
@@ -25,20 +25,7 @@
           <w:b/>
           <w:sz w:val="22"/>
         </w:rPr>
-        <w:t>課堂必寫｜先試解並留依據；卡住可記卡點。</w:t>
-      </w:r>
-    </w:p>
-    <w:p>
-      <w:pPr>
-        <w:spacing w:after="100" w:line="312" w:lineRule="auto"/>
-      </w:pPr>
-      <w:r>
-        <w:rPr>
-          <w:rFonts w:ascii="Arial Unicode MS" w:hAnsi="Arial Unicode MS" w:eastAsia="Arial Unicode MS"/>
-          <w:b w:val="0"/>
-          <w:sz w:val="22"/>
-        </w:rPr>
-        <w:t>本段不使用 AI。先留下自己的解法，再按需要看投影提示。</w:t>
+        <w:t>課內 83–95 分｜先獨立試，再回查，不計分。</w:t>
       </w:r>
     </w:p>
     <w:p>
@@ -113,7 +100,7 @@
           <w:b w:val="0"/>
           <w:sz w:val="22"/>
         </w:rPr>
-        <w:t>讀不下去時的知識卡｜特有：只分布在某個限定地區。詞注幫助讀懂用語，筆記能否使用仍要回原文判斷。</w:t>
+        <w:t>需要時回查｜特有：只分布在某個限定地區。詞注幫助讀懂用語，筆記能否使用仍要回原文判斷。</w:t>
       </w:r>
     </w:p>
     <w:p>
@@ -124,9 +111,9 @@
         <w:rPr>
           <w:rFonts w:ascii="Arial Unicode MS" w:hAnsi="Arial Unicode MS" w:eastAsia="Arial Unicode MS"/>
           <w:b w:val="0"/>
-          <w:sz w:val="18"/>
+          <w:sz w:val="20"/>
         </w:rPr>
-        <w:t>來源：大考中心公開試題；原卷連結見投影及本週 README。</w:t>
+        <w:t>完整原題不等於全題必做。延伸可回家看；連結見本週投影與網站。</w:t>
       </w:r>
     </w:p>
     <w:p>
@@ -144,7 +131,7 @@
           <w:b/>
           <w:sz w:val="44"/>
         </w:rPr>
-        <w:t>W1｜留下自己的解題歷程</w:t>
+        <w:t>W1｜自己的解題來路</w:t>
       </w:r>
     </w:p>
     <w:p>
@@ -157,7 +144,7 @@
           <w:b w:val="0"/>
           <w:sz w:val="22"/>
         </w:rPr>
-        <w:t>班級：＿＿＿　座號：＿＿＿　姓名：＿＿＿＿</w:t>
+        <w:t>班級＿＿＿　座號＿＿＿　姓名＿＿＿＿</w:t>
       </w:r>
     </w:p>
     <w:p>
@@ -170,7 +157,7 @@
           <w:b/>
           <w:sz w:val="30"/>
         </w:rPr>
-        <w:t>01　初答與依據／草圖／算式</w:t>
+        <w:t>01｜初答與依據／草圖／算式</w:t>
       </w:r>
     </w:p>
     <w:p>
@@ -183,7 +170,7 @@
           <w:b w:val="0"/>
           <w:sz w:val="22"/>
         </w:rPr>
-        <w:t>直接在正面材料圈線索，在這裡留解法。未解完也保留已走到的步驟。</w:t>
+        <w:t>先不用 AI。正面可直接圈線索；未解完，記已走到的步驟或卡點。</w:t>
       </w:r>
     </w:p>
     <w:p>
@@ -260,7 +247,7 @@
           <w:b/>
           <w:sz w:val="30"/>
         </w:rPr>
-        <w:t>02　實際用到的提示、搭檔追問或回讀</w:t>
+        <w:t>02｜提示與搭檔實際回應</w:t>
       </w:r>
     </w:p>
     <w:p>
@@ -273,7 +260,7 @@
           <w:b w:val="0"/>
           <w:sz w:val="22"/>
         </w:rPr>
-        <w:t>提示：□未用　□1　□2　□3　　搭檔座號：＿＿＿</w:t>
+        <w:t>提示 □未用 □1 □2 □3　搭檔座號＿＿＿</w:t>
       </w:r>
     </w:p>
     <w:p>
@@ -318,7 +305,7 @@
           <w:b/>
           <w:sz w:val="30"/>
         </w:rPr>
-        <w:t>03　本人改／留與理由</w:t>
+        <w:t>03｜本人改／留與理由</w:t>
       </w:r>
     </w:p>
     <w:p>
@@ -384,22 +371,6 @@
     </w:p>
     <w:p>
       <w:pPr>
-        <w:spacing w:after="0" w:line="510" w:lineRule="exact"/>
-        <w:pBdr>
-          <w:bottom w:val="single" w:sz="4" w:color="CBD5E1"/>
-        </w:pBdr>
-      </w:pPr>
-      <w:r>
-        <w:rPr>
-          <w:rFonts w:ascii="Arial Unicode MS" w:hAnsi="Arial Unicode MS" w:eastAsia="Arial Unicode MS"/>
-          <w:b w:val="0"/>
-          <w:sz w:val="22"/>
-        </w:rPr>
-        <w:t xml:space="preserve">　</w:t>
-      </w:r>
-    </w:p>
-    <w:p>
-      <w:pPr>
         <w:spacing w:after="100" w:line="312" w:lineRule="auto"/>
       </w:pPr>
       <w:r>
@@ -408,7 +379,7 @@
           <w:b/>
           <w:sz w:val="30"/>
         </w:rPr>
-        <w:t>04　最後看詳解，再核對一步</w:t>
+        <w:t>04｜看詳解，只核對一步</w:t>
       </w:r>
     </w:p>
     <w:p>
@@ -421,7 +392,7 @@
           <w:b w:val="0"/>
           <w:sz w:val="22"/>
         </w:rPr>
-        <w:t>□與我的理由相符　□發現一處差異　□仍有疑問。位置／下一步要查：</w:t>
+        <w:t>□相符 □發現差異 □仍有疑問；位置／下一步要查：</w:t>
       </w:r>
     </w:p>
     <w:p>
@@ -464,9 +435,22 @@
         <w:rPr>
           <w:rFonts w:ascii="Arial Unicode MS" w:hAnsi="Arial Unicode MS" w:eastAsia="Arial Unicode MS"/>
           <w:b w:val="0"/>
-          <w:sz w:val="18"/>
+          <w:sz w:val="20"/>
         </w:rPr>
-        <w:t>紙本收回併入本週歷程本；不另拍照上傳、不計分、不新增關卡。詳解可拍照回讀。</w:t>
+        <w:t>可拍自己的原答與詳解自用；不另上傳。學科卡夾回主本合收。</w:t>
+      </w:r>
+    </w:p>
+    <w:p>
+      <w:pPr>
+        <w:spacing w:after="100" w:line="312" w:lineRule="auto"/>
+      </w:pPr>
+      <w:r>
+        <w:rPr>
+          <w:rFonts w:ascii="Arial Unicode MS" w:hAnsi="Arial Unicode MS" w:eastAsia="Arial Unicode MS"/>
+          <w:b w:val="0"/>
+          <w:sz w:val="20"/>
+        </w:rPr>
+        <w:t>課內未完成就記卡點，不自動變必交作業；延伸不列缺件。</w:t>
       </w:r>
     </w:p>
     <w:sectPr>
@@ -492,7 +476,7 @@
         <w:b w:val="0"/>
         <w:sz w:val="18"/>
       </w:rPr>
-      <w:t xml:space="preserve">閱讀理解與表達 · W1 學科遷移 · 第 </w:t>
+      <w:t xml:space="preserve">W1・學科遷移・第 </w:t>
     </w:r>
     <w:fldSimple w:instr="PAGE"/>
     <w:r>

</xml_diff>

<commit_message>
Clarify W1 source-check task and add visual reasoning guides
</commit_message>
<xml_diff>
--- a/worksheets/W1_學科遷移.docx
+++ b/worksheets/W1_學科遷移.docx
@@ -38,7 +38,7 @@
           <w:b w:val="0"/>
           <w:sz w:val="21"/>
         </w:rPr>
-        <w:t>115 學測國綜第 6–8 題材料・印刷第 2 頁。原材料節錄；查筆記任務為本課另擬，非第 7 題原題。</w:t>
+        <w:t>115 學測國綜第 6–8 題材料・印刷第 2 頁。原材料節錄；查核問題由本課設計，非第 7 題原題。</w:t>
       </w:r>
     </w:p>
     <w:p>
@@ -87,7 +87,7 @@
           <w:b/>
           <w:sz w:val="22"/>
         </w:rPr>
-        <w:t>任務｜讀學科卡的材料，判斷這句教師另擬筆記能否使用：『臺灣杉只存在臺灣。』寫下初判與依據位置；可改寫或保留。</w:t>
+        <w:t>任務｜這句話，原文支持嗎？「臺灣杉只存在臺灣。」先讀原文，留下初判與依據位置，再決定保留或改寫，並說明理由；資料不足可暫不判定。</w:t>
       </w:r>
     </w:p>
     <w:p>
@@ -100,7 +100,7 @@
           <w:b w:val="0"/>
           <w:sz w:val="22"/>
         </w:rPr>
-        <w:t>需要時回查｜特有：只分布在某個限定地區。詞注幫助讀懂用語，筆記能否使用仍要回原文判斷。</w:t>
+        <w:t>需要時回查｜特有：只分布在某個限定地區。詞注幫助讀懂用語，這句話是否成立仍要回原文判斷。</w:t>
       </w:r>
     </w:p>
     <w:p>
@@ -318,7 +318,7 @@
           <w:b w:val="0"/>
           <w:sz w:val="22"/>
         </w:rPr>
-        <w:t>把查過的版本寫成一句可用筆記；旁記原文位置。</w:t>
+        <w:t>寫下你決定保留或改寫的句子；旁記原文位置與理由。</w:t>
       </w:r>
     </w:p>
     <w:p>

</xml_diff>